<commit_message>
Tighten the wording of the do file comments and the guide
Replace stock phrases with plain statements and reflow the Punjab
mortality note. No Stata code changes.
</commit_message>
<xml_diff>
--- a/2. Notes/Do file guide.docx
+++ b/2. Notes/Do file guide.docx
@@ -96,7 +96,7 @@
           <w:sz w:val="17"/>
           <w:szCs w:val="17"/>
         </w:rPr>
-        <w:t xml:space="preserve">Each section follows the same three steps. It reads the raw file and builds an indicator on a stated universe and weight. It applies the index construction, which Sections 5, 16, 17, 18, 23, 24 and 25 first recover by inverting NHDR's own printed tables. It then sets the result beside its target with nhdr_check, which writes one line to Checks.txt: PASS or FAIL, the value computed, the target and the tolerance. A target tagged [published] is a printed figure from NHDR, PBS, MICS, PDHS or UNDP. A target tagged [reference] is the value an independent Python implementation produced from the same files. The tolerance is half a unit of the last printed digit plus a small margin for floating point.</w:t>
+        <w:t xml:space="preserve">Each section works in three steps. It reads the raw file and builds an indicator on a stated universe and weight. It applies the index construction, which Sections 5, 16, 17, 18, 23, 24 and 25 first recover by inverting NHDR's own printed tables. It then sets the result beside its target with nhdr_check, which writes one line to Checks.txt: PASS or FAIL, the value computed, the target and the tolerance. A target tagged [published] is a printed figure from NHDR, PBS, MICS, PDHS or UNDP. A target tagged [reference] is the value an independent Python implementation produced from the same files. The tolerance is half a unit of the last printed digit plus a small margin for floating point.</w:t>
       </w:r>
     </w:p>
     <w:p>
@@ -120,7 +120,7 @@
           <w:sz w:val="17"/>
           <w:szCs w:val="17"/>
         </w:rPr>
-        <w:t xml:space="preserve">The capture prefix runs a command and carries on if it fails. It is used only where failure is expected or harmless: capture program drop clears a program left in memory by an earlier run, capture mkdir tolerates an existing folder, capture confirm file and capture confirm variable test for existence and set _rc, and capture noisily { } wraps every chart so that a graphics problem cannot stop the run. Every loop over hard-coded values now carries a comment naming where the values come from: a published table, a DHS or PBS code list, or the independent reference.</w:t>
+        <w:t xml:space="preserve">The capture prefix runs a command and carries on if it fails. The do file uses it only where a failure is expected or harmless: capture program drop clears a program left in memory by an earlier run, capture mkdir tolerates an existing folder, capture confirm file and capture confirm variable test for existence and set _rc, and capture noisily { } wraps every chart so that a graphics problem cannot stop the run. Every loop over hard-coded values now carries a comment naming where the values come from: a published table, a DHS or PBS code list, or the independent reference.</w:t>
       </w:r>
     </w:p>
     <w:p>
@@ -1909,7 +1909,7 @@
                 <w:sz w:val="15"/>
                 <w:szCs w:val="15"/>
               </w:rPr>
-              <w:t xml:space="preserve">PBS 2024-25 key findings.</w:t>
+              <w:t xml:space="preserve">PBS HIES 2024-25 Key Findings Report.</w:t>
             </w:r>
           </w:p>
         </w:tc>
@@ -3791,7 +3791,7 @@
           <w:sz w:val="17"/>
           <w:szCs w:val="17"/>
         </w:rPr>
-        <w:t xml:space="preserve">The figures in 4. Plots/2. Figures reproduced NHDR style are not drawn by the do file. 7. Python tools/figures.py draws them in the report's layout and typeface from the result tables the do file writes: HDI all microdata.csv and IHDI all microdata.csv (Section 20.6), the Series files of Section 26A, and the CDI, YDI, GDI, GII and LDI tables of Sections 17 to 25. juxtapose.py then sets each beside the figure cropped from the report (folders 1 and 3). The two reproduced sets do not always plot the same basis: the NHDR-style figures plot the all-microdata four-year series, while several Stata charts plot the 2018-19 and 2024-25 variants.</w:t>
+        <w:t xml:space="preserve">The figures in 4. Plots/2. Figures reproduced NHDR style are not drawn by the do file. 7. Python tools/figures.py draws them in the report's layout and typeface from the result tables the do file writes: HDI all microdata.csv and IHDI all microdata.csv (Section 20.6), the Series files of Section 26A, and the CDI, YDI, GDI, GII and LDI tables of Sections 17 to 25. juxtapose.py then sets each beside the figure cropped from the report (folders 1 and 3). The two reproduced sets do not always plot the same series. The NHDR-style figures plot the all-microdata four-year series, while several Stata charts plot the 2018-19 and 2024-25 variants.</w:t>
       </w:r>
     </w:p>
     <w:p>
@@ -3834,7 +3834,7 @@
           <w:sz w:val="17"/>
           <w:szCs w:val="17"/>
         </w:rPr>
-        <w:t xml:space="preserve">Every published index is reproduced from NHDR's own inputs within the rounding of those inputs, so the arithmetic of each construction is now known. The HDI uses goalposts no UNDP report uses (health 25 to 90 years, income 100 to 100,000 PPP dollars), and the GDI uses a different income ceiling (75,000) in the same report. The YDI survival goalposts are misprinted. None of this is documented in NHDR.</w:t>
+        <w:t xml:space="preserve">Every published index is reproduced from NHDR's own inputs within the rounding of those inputs. Each construction is now known exactly. The HDI uses goalposts no UNDP report uses (health 25 to 90 years, income 100 to 100,000 PPP dollars), and the GDI uses a different income ceiling (75,000) in the same report. The YDI survival goalposts are misprinted. NHDR documents none of it.</w:t>
       </w:r>
     </w:p>
     <w:p>
@@ -3858,7 +3858,7 @@
           <w:sz w:val="17"/>
           <w:szCs w:val="17"/>
         </w:rPr>
-        <w:t xml:space="preserve">Education reproduces from HIES to the printed decimal. Health depends on the survey chosen: MICS6 gives life expectancy 2.9 to 7.0 years above PDHS, which reorders the provinces. Income is the weakest link: its level is World Bank GNI per head, its distribution is survey consumption scaled up about threefold, and its provincial pattern matches no published estimate of regional product, Pasha's included. NHDR's labor indicators labeled 2018-19 are LFS 2017-18, and its early-marriage rate (20.0 percent) is reproduced by no survey on disk (12.3 to 12.6 percent).</w:t>
+        <w:t xml:space="preserve">Education reproduces from HIES to the printed decimal. The health result depends on the survey. MICS6 gives life expectancy 2.9 to 7.0 years above PDHS, which reorders the provinces. Income reproduces least well. Its level is World Bank GNI per head, its distribution is survey consumption scaled up about threefold, and its provincial pattern matches no published estimate of regional product, Pasha's included. NHDR's labor indicators labeled 2018-19 are LFS 2017-18, and its early-marriage rate (20.0 percent) is reproduced by no survey on disk (12.3 to 12.6 percent).</w:t>
       </w:r>
     </w:p>
     <w:p>

</xml_diff>